<commit_message>
Deployed c2340bd with MkDocs version: 1.6.1
</commit_message>
<xml_diff>
--- a/resources/A11_Organisational_heat_pump_strategic_review_outline_process.docx
+++ b/resources/A11_Organisational_heat_pump_strategic_review_outline_process.docx
@@ -307,6 +307,7 @@
           <w:b/>
           <w:bCs/>
         </w:rPr>
+        <w:lastRenderedPageBreak/>
         <w:br w:type="page"/>
       </w:r>
     </w:p>
@@ -324,6 +325,7 @@
         </w:rPr>
       </w:pPr>
       <w:r>
+        <w:lastRenderedPageBreak/>
         <w:fldChar w:fldCharType="begin"/>
       </w:r>
       <w:r>
@@ -2135,6 +2137,7 @@
       </w:pPr>
       <w:bookmarkStart w:id="0" w:name="_Toc224212509"/>
       <w:r>
+        <w:lastRenderedPageBreak/>
         <w:t>Background</w:t>
       </w:r>
       <w:bookmarkEnd w:id="0"/>
@@ -2483,6 +2486,7 @@
           <w:i/>
           <w:iCs/>
         </w:rPr>
+        <w:lastRenderedPageBreak/>
         <w:t xml:space="preserve">Collaborating better with local retrofit businesses to support their growth, </w:t>
       </w:r>
       <w:r>
@@ -2544,6 +2548,7 @@
       </w:pPr>
       <w:bookmarkStart w:id="5" w:name="_Toc224212511"/>
       <w:r>
+        <w:lastRenderedPageBreak/>
         <w:t>Approach to review</w:t>
       </w:r>
       <w:bookmarkEnd w:id="5"/>
@@ -2946,7 +2951,7 @@
               </wp:anchor>
             </w:drawing>
           </mc:Choice>
-          <mc:Fallback xmlns:arto="http://schemas.microsoft.com/office/word/2006/arto" xmlns:dgm="http://schemas.openxmlformats.org/drawingml/2006/diagram" xmlns:a14="http://schemas.microsoft.com/office/drawing/2010/main" xmlns:pic="http://schemas.openxmlformats.org/drawingml/2006/picture" xmlns:a16="http://schemas.microsoft.com/office/drawing/2014/main" xmlns:a="http://schemas.openxmlformats.org/drawingml/2006/main">
+          <mc:Fallback xmlns:a="http://schemas.openxmlformats.org/drawingml/2006/main" xmlns:a16="http://schemas.microsoft.com/office/drawing/2014/main" xmlns:pic="http://schemas.openxmlformats.org/drawingml/2006/picture" xmlns:a14="http://schemas.microsoft.com/office/drawing/2010/main" xmlns:dgm="http://schemas.openxmlformats.org/drawingml/2006/diagram" xmlns:arto="http://schemas.microsoft.com/office/word/2006/arto" xmlns="">
             <w:pict>
               <v:group id="Group 12" style="position:absolute;margin-left:-12pt;margin-top:20.85pt;width:582pt;height:73pt;z-index:251658241;mso-width-relative:margin;mso-height-relative:margin" coordsize="62666,3168" o:spid="_x0000_s1026" w14:anchorId="0EAA0F82" o:gfxdata="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">
                 <v:shapetype id="_x0000_t15" coordsize="21600,21600" o:spt="15" adj="16200" path="m@0,l,,,21600@0,21600,21600,10800xe">
@@ -3168,6 +3173,7 @@
       </w:pPr>
       <w:bookmarkStart w:id="7" w:name="_Toc224212513"/>
       <w:r>
+        <w:lastRenderedPageBreak/>
         <w:t>Focus areas for cycles:</w:t>
       </w:r>
       <w:bookmarkEnd w:id="7"/>
@@ -3352,7 +3358,7 @@
               </wp:anchor>
             </w:drawing>
           </mc:Choice>
-          <mc:Fallback xmlns:arto="http://schemas.microsoft.com/office/word/2006/arto" xmlns:dgm="http://schemas.openxmlformats.org/drawingml/2006/diagram" xmlns:a14="http://schemas.microsoft.com/office/drawing/2010/main" xmlns:pic="http://schemas.openxmlformats.org/drawingml/2006/picture" xmlns:a16="http://schemas.microsoft.com/office/drawing/2014/main" xmlns:a="http://schemas.openxmlformats.org/drawingml/2006/main">
+          <mc:Fallback xmlns:a="http://schemas.openxmlformats.org/drawingml/2006/main" xmlns:a16="http://schemas.microsoft.com/office/drawing/2014/main" xmlns:pic="http://schemas.openxmlformats.org/drawingml/2006/picture" xmlns:a14="http://schemas.microsoft.com/office/drawing/2010/main" xmlns:dgm="http://schemas.openxmlformats.org/drawingml/2006/diagram" xmlns:arto="http://schemas.microsoft.com/office/word/2006/arto" xmlns="">
             <w:pict>
               <v:shapetype id="_x0000_t202" coordsize="21600,21600" o:spt="202" path="m,l,21600r21600,l21600,xe" w14:anchorId="45DA78D5">
                 <v:stroke joinstyle="miter"/>
@@ -4090,7 +4096,7 @@
               </wp:anchor>
             </w:drawing>
           </mc:Choice>
-          <mc:Fallback xmlns:arto="http://schemas.microsoft.com/office/word/2006/arto" xmlns:dgm="http://schemas.openxmlformats.org/drawingml/2006/diagram" xmlns:a14="http://schemas.microsoft.com/office/drawing/2010/main" xmlns:pic="http://schemas.openxmlformats.org/drawingml/2006/picture" xmlns:a16="http://schemas.microsoft.com/office/drawing/2014/main" xmlns:a="http://schemas.openxmlformats.org/drawingml/2006/main">
+          <mc:Fallback xmlns:a="http://schemas.openxmlformats.org/drawingml/2006/main" xmlns:a16="http://schemas.microsoft.com/office/drawing/2014/main" xmlns:pic="http://schemas.openxmlformats.org/drawingml/2006/picture" xmlns:a14="http://schemas.microsoft.com/office/drawing/2010/main" xmlns:dgm="http://schemas.openxmlformats.org/drawingml/2006/diagram" xmlns:arto="http://schemas.microsoft.com/office/word/2006/arto" xmlns="">
             <w:pict>
               <v:group id="Group 1" style="position:absolute;margin-left:22.1pt;margin-top:.35pt;width:599.85pt;height:250.2pt;z-index:251658244" coordsize="76179,31774" o:spid="_x0000_s1032" w14:anchorId="6EBF553D" o:gfxdata="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">
                 <v:group id="Group 22" style="position:absolute;top:362;width:18689;height:31050" coordsize="18689,31050" o:spid="_x0000_s1033" o:gfxdata="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">
@@ -4581,7 +4587,7 @@
               </wp:anchor>
             </w:drawing>
           </mc:Choice>
-          <mc:Fallback xmlns:arto="http://schemas.microsoft.com/office/word/2006/arto" xmlns:dgm="http://schemas.openxmlformats.org/drawingml/2006/diagram" xmlns:a14="http://schemas.microsoft.com/office/drawing/2010/main" xmlns:pic="http://schemas.openxmlformats.org/drawingml/2006/picture" xmlns:a16="http://schemas.microsoft.com/office/drawing/2014/main" xmlns:a="http://schemas.openxmlformats.org/drawingml/2006/main">
+          <mc:Fallback xmlns:a="http://schemas.openxmlformats.org/drawingml/2006/main" xmlns:a16="http://schemas.microsoft.com/office/drawing/2014/main" xmlns:pic="http://schemas.openxmlformats.org/drawingml/2006/picture" xmlns:a14="http://schemas.microsoft.com/office/drawing/2010/main" xmlns:dgm="http://schemas.openxmlformats.org/drawingml/2006/diagram" xmlns:arto="http://schemas.microsoft.com/office/word/2006/arto" xmlns="">
             <w:pict>
               <v:shape id="_x0000_s1049" style="position:absolute;left:0;text-align:left;margin-left:672.15pt;margin-top:25.4pt;width:46.3pt;height:110.6pt;z-index:251658245;visibility:visible;mso-wrap-style:square;mso-width-percent:0;mso-height-percent:200;mso-wrap-distance-left:9pt;mso-wrap-distance-top:3.6pt;mso-wrap-distance-right:9pt;mso-wrap-distance-bottom:3.6pt;mso-position-horizontal:absolute;mso-position-horizontal-relative:text;mso-position-vertical:absolute;mso-position-vertical-relative:text;mso-width-percent:0;mso-height-percent:200;mso-width-relative:margin;mso-height-relative:margin;v-text-anchor:top" fillcolor="#ebe8ec [665]" type="#_x0000_t202" o:gfxdata="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" w14:anchorId="75EB95F5">
                 <v:textbox style="mso-fit-shape-to-text:t">
@@ -4860,7 +4866,7 @@
               </wp:anchor>
             </w:drawing>
           </mc:Choice>
-          <mc:Fallback xmlns:arto="http://schemas.microsoft.com/office/word/2006/arto" xmlns:dgm="http://schemas.openxmlformats.org/drawingml/2006/diagram" xmlns:a14="http://schemas.microsoft.com/office/drawing/2010/main" xmlns:pic="http://schemas.openxmlformats.org/drawingml/2006/picture" xmlns:a16="http://schemas.microsoft.com/office/drawing/2014/main" xmlns:a="http://schemas.openxmlformats.org/drawingml/2006/main">
+          <mc:Fallback xmlns:a="http://schemas.openxmlformats.org/drawingml/2006/main" xmlns:a16="http://schemas.microsoft.com/office/drawing/2014/main" xmlns:pic="http://schemas.openxmlformats.org/drawingml/2006/picture" xmlns:a14="http://schemas.microsoft.com/office/drawing/2010/main" xmlns:dgm="http://schemas.openxmlformats.org/drawingml/2006/diagram" xmlns:arto="http://schemas.microsoft.com/office/word/2006/arto" xmlns="">
             <w:pict>
               <v:group id="Group 14" style="position:absolute;left:0;text-align:left;margin-left:0;margin-top:11.3pt;width:664.35pt;height:58.25pt;z-index:251658242;mso-position-horizontal:left;mso-position-horizontal-relative:margin" coordsize="84378,10952" o:spid="_x0000_s1050" w14:anchorId="3DE5FCCC" o:gfxdata="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">
                 <v:shapetype id="_x0000_t32" coordsize="21600,21600" o:oned="t" filled="f" o:spt="32" path="m,l21600,21600e">
@@ -5041,6 +5047,7 @@
       </w:pPr>
       <w:bookmarkStart w:id="9" w:name="_Toc224212514"/>
       <w:r>
+        <w:lastRenderedPageBreak/>
         <w:t xml:space="preserve">Overall </w:t>
       </w:r>
       <w:r>
@@ -5236,6 +5243,7 @@
       </w:pPr>
       <w:bookmarkStart w:id="10" w:name="_Toc224212515"/>
       <w:r>
+        <w:lastRenderedPageBreak/>
         <w:t>Areas of focus</w:t>
       </w:r>
       <w:bookmarkEnd w:id="10"/>
@@ -5296,13 +5304,13 @@
         <w:tblLook w:val="04A0" w:firstRow="1" w:lastRow="0" w:firstColumn="1" w:lastColumn="0" w:noHBand="0" w:noVBand="1"/>
       </w:tblPr>
       <w:tblGrid>
-        <w:gridCol w:w="2402"/>
-        <w:gridCol w:w="2020"/>
-        <w:gridCol w:w="1016"/>
-        <w:gridCol w:w="1186"/>
-        <w:gridCol w:w="827"/>
-        <w:gridCol w:w="995"/>
-        <w:gridCol w:w="1014"/>
+        <w:gridCol w:w="2918"/>
+        <w:gridCol w:w="1151"/>
+        <w:gridCol w:w="1050"/>
+        <w:gridCol w:w="1222"/>
+        <w:gridCol w:w="1021"/>
+        <w:gridCol w:w="1046"/>
+        <w:gridCol w:w="1052"/>
       </w:tblGrid>
       <w:tr>
         <w:tc>
@@ -6666,6 +6674,7 @@
         </w:numPr>
       </w:pPr>
       <w:r>
+        <w:lastRenderedPageBreak/>
         <w:t>Quick wins</w:t>
       </w:r>
     </w:p>
@@ -6680,6 +6689,7 @@
       </w:pPr>
       <w:bookmarkStart w:id="20" w:name="_Toc224212517"/>
       <w:r>
+        <w:lastRenderedPageBreak/>
         <w:t xml:space="preserve">Summary of </w:t>
       </w:r>
       <w:r>
@@ -6927,9 +6937,9 @@
         <w:tblLook w:val="04A0" w:firstRow="1" w:lastRow="0" w:firstColumn="1" w:lastColumn="0" w:noHBand="0" w:noVBand="1"/>
       </w:tblPr>
       <w:tblGrid>
-        <w:gridCol w:w="3483"/>
-        <w:gridCol w:w="1952"/>
-        <w:gridCol w:w="3916"/>
+        <w:gridCol w:w="3477"/>
+        <w:gridCol w:w="2077"/>
+        <w:gridCol w:w="3797"/>
       </w:tblGrid>
       <w:tr>
         <w:trPr>
@@ -7069,7 +7079,11 @@
               <w:t>Recommendations</w:t>
             </w:r>
             <w:r>
-              <w:t xml:space="preserve"> of where the planning process can influence the quality of outcomes for heat pump installs</w:t>
+              <w:t xml:space="preserve"> of where the planning process can influence the quality of outcomes for heat </w:t>
+            </w:r>
+            <w:r>
+              <w:lastRenderedPageBreak/>
+              <w:t>pump installs</w:t>
             </w:r>
             <w:r>
               <w:t xml:space="preserve"> (sustainability statements, noise, heritage, discharge process)</w:t>
@@ -7090,6 +7104,7 @@
               <w:cnfStyle w:val="000000000000" w:firstRow="0" w:lastRow="0" w:firstColumn="0" w:lastColumn="0" w:oddVBand="0" w:evenVBand="0" w:oddHBand="0" w:evenHBand="0" w:firstRowFirstColumn="0" w:firstRowLastColumn="0" w:lastRowFirstColumn="0" w:lastRowLastColumn="0"/>
             </w:pPr>
             <w:r>
+              <w:lastRenderedPageBreak/>
               <w:t xml:space="preserve">Recommendation report/ presentation to planning team </w:t>
             </w:r>
           </w:p>
@@ -7159,9 +7174,9 @@
         <w:tblLook w:val="04A0" w:firstRow="1" w:lastRow="0" w:firstColumn="1" w:lastColumn="0" w:noHBand="0" w:noVBand="1"/>
       </w:tblPr>
       <w:tblGrid>
-        <w:gridCol w:w="3443"/>
-        <w:gridCol w:w="2046"/>
-        <w:gridCol w:w="3862"/>
+        <w:gridCol w:w="3425"/>
+        <w:gridCol w:w="2193"/>
+        <w:gridCol w:w="3733"/>
       </w:tblGrid>
       <w:tr>
         <w:trPr>
@@ -7586,6 +7601,7 @@
       </w:pPr>
       <w:bookmarkStart w:id="28" w:name="_Toc224212522"/>
       <w:r>
+        <w:lastRenderedPageBreak/>
         <w:t>Handover</w:t>
       </w:r>
       <w:bookmarkEnd w:id="28"/>
@@ -7881,9 +7897,9 @@
         <w:tblLook w:val="04A0" w:firstRow="1" w:lastRow="0" w:firstColumn="1" w:lastColumn="0" w:noHBand="0" w:noVBand="1"/>
       </w:tblPr>
       <w:tblGrid>
-        <w:gridCol w:w="3445"/>
-        <w:gridCol w:w="2046"/>
-        <w:gridCol w:w="3860"/>
+        <w:gridCol w:w="3429"/>
+        <w:gridCol w:w="2193"/>
+        <w:gridCol w:w="3729"/>
       </w:tblGrid>
       <w:tr>
         <w:trPr>
@@ -8233,9 +8249,9 @@
         <w:tblLook w:val="04A0" w:firstRow="1" w:lastRow="0" w:firstColumn="1" w:lastColumn="0" w:noHBand="0" w:noVBand="1"/>
       </w:tblPr>
       <w:tblGrid>
-        <w:gridCol w:w="3472"/>
-        <w:gridCol w:w="1952"/>
-        <w:gridCol w:w="3927"/>
+        <w:gridCol w:w="3455"/>
+        <w:gridCol w:w="2077"/>
+        <w:gridCol w:w="3819"/>
       </w:tblGrid>
       <w:tr>
         <w:trPr>
@@ -8354,6 +8370,7 @@
               </w:numPr>
             </w:pPr>
             <w:r>
+              <w:lastRenderedPageBreak/>
               <w:t>Assess existing stock</w:t>
             </w:r>
             <w:r>
@@ -8798,6 +8815,7 @@
       </w:pPr>
       <w:bookmarkStart w:id="32" w:name="_Toc224212526"/>
       <w:r>
+        <w:lastRenderedPageBreak/>
         <w:t>Service</w:t>
       </w:r>
       <w:r>
@@ -9209,6 +9227,7 @@
       </w:pPr>
       <w:bookmarkStart w:id="35" w:name="_Toc224212528"/>
       <w:r>
+        <w:lastRenderedPageBreak/>
         <w:t>Non</w:t>
       </w:r>
       <w:r>
@@ -9279,9 +9298,9 @@
         <w:tblLook w:val="04A0" w:firstRow="1" w:lastRow="0" w:firstColumn="1" w:lastColumn="0" w:noHBand="0" w:noVBand="1"/>
       </w:tblPr>
       <w:tblGrid>
-        <w:gridCol w:w="3547"/>
-        <w:gridCol w:w="1638"/>
-        <w:gridCol w:w="4166"/>
+        <w:gridCol w:w="3531"/>
+        <w:gridCol w:w="1704"/>
+        <w:gridCol w:w="4116"/>
       </w:tblGrid>
       <w:tr>
         <w:trPr>
@@ -9456,6 +9475,7 @@
       </w:pPr>
       <w:bookmarkStart w:id="37" w:name="_Toc224212529"/>
       <w:r>
+        <w:lastRenderedPageBreak/>
         <w:t>St</w:t>
       </w:r>
       <w:r>
@@ -10154,7 +10174,7 @@
             </wp:anchor>
           </w:drawing>
         </mc:Choice>
-        <mc:Fallback xmlns:arto="http://schemas.microsoft.com/office/word/2006/arto" xmlns:aclsh="http://schemas.microsoft.com/office/drawing/2020/classificationShape" xmlns:a16="http://schemas.microsoft.com/office/drawing/2014/main" xmlns:a="http://schemas.openxmlformats.org/drawingml/2006/main">
+        <mc:Fallback xmlns:a="http://schemas.openxmlformats.org/drawingml/2006/main" xmlns:a16="http://schemas.microsoft.com/office/drawing/2014/main" xmlns:aclsh="http://schemas.microsoft.com/office/drawing/2020/classificationShape" xmlns:arto="http://schemas.microsoft.com/office/word/2006/arto" xmlns="">
           <w:pict>
             <v:shapetype id="_x0000_t202" coordsize="21600,21600" o:spt="202" path="m,l,21600r21600,l21600,xe" w14:anchorId="20A83F69">
               <v:stroke joinstyle="miter"/>
@@ -10287,7 +10307,7 @@
             </wp:anchor>
           </w:drawing>
         </mc:Choice>
-        <mc:Fallback xmlns:arto="http://schemas.microsoft.com/office/word/2006/arto" xmlns:aclsh="http://schemas.microsoft.com/office/drawing/2020/classificationShape" xmlns:a16="http://schemas.microsoft.com/office/drawing/2014/main" xmlns:a="http://schemas.openxmlformats.org/drawingml/2006/main">
+        <mc:Fallback xmlns:a="http://schemas.openxmlformats.org/drawingml/2006/main" xmlns:a16="http://schemas.microsoft.com/office/drawing/2014/main" xmlns:aclsh="http://schemas.microsoft.com/office/drawing/2020/classificationShape" xmlns:arto="http://schemas.microsoft.com/office/word/2006/arto" xmlns="">
           <w:pict>
             <v:shapetype id="_x0000_t202" coordsize="21600,21600" o:spt="202" path="m,l,21600r21600,l21600,xe" w14:anchorId="79F8D2E4">
               <v:stroke joinstyle="miter"/>
@@ -10420,7 +10440,7 @@
             </wp:anchor>
           </w:drawing>
         </mc:Choice>
-        <mc:Fallback xmlns:arto="http://schemas.microsoft.com/office/word/2006/arto" xmlns:aclsh="http://schemas.microsoft.com/office/drawing/2020/classificationShape" xmlns:a16="http://schemas.microsoft.com/office/drawing/2014/main" xmlns:a="http://schemas.openxmlformats.org/drawingml/2006/main">
+        <mc:Fallback xmlns:a="http://schemas.openxmlformats.org/drawingml/2006/main" xmlns:a16="http://schemas.microsoft.com/office/drawing/2014/main" xmlns:aclsh="http://schemas.microsoft.com/office/drawing/2020/classificationShape" xmlns:arto="http://schemas.microsoft.com/office/word/2006/arto" xmlns="">
           <w:pict>
             <v:shapetype id="_x0000_t202" coordsize="21600,21600" o:spt="202" path="m,l,21600r21600,l21600,xe" w14:anchorId="5EFA7387">
               <v:stroke joinstyle="miter"/>
@@ -18029,10 +18049,10 @@
     <dgm:cxn modelId="{1523D512-CBC4-4263-943D-369AE69755B3}" type="presOf" srcId="{0B3A1F6D-74AC-4F00-989C-74A65FA6F9A0}" destId="{C7B82EC5-57FD-4DFB-8692-E1B0E88F2C12}" srcOrd="0" destOrd="0" presId="urn:microsoft.com/office/officeart/2005/8/layout/cycle2"/>
     <dgm:cxn modelId="{B89D4A20-A9A4-4169-896D-DBF22EF14A70}" srcId="{CF7B38A6-BDF5-4ADE-8C80-0AFF2926D96E}" destId="{D9E4237F-C0EF-4738-B65F-8A6DF5F1296E}" srcOrd="0" destOrd="0" parTransId="{7EB06E0D-2728-4216-AE86-683E4C12720E}" sibTransId="{AAFF2AC0-A20D-4674-8CF1-6922B0AF3A42}"/>
     <dgm:cxn modelId="{8047CD2D-1B6D-42F1-961A-2531F4FAABCB}" type="presOf" srcId="{D62CB151-6B45-4224-8A5C-BB757B17EA00}" destId="{628C821E-22AB-433A-841A-B9E0C956E1F4}" srcOrd="1" destOrd="0" presId="urn:microsoft.com/office/officeart/2005/8/layout/cycle2"/>
+    <dgm:cxn modelId="{78DE9457-F6C0-4D70-998B-9E4219EDB214}" srcId="{CF7B38A6-BDF5-4ADE-8C80-0AFF2926D96E}" destId="{2403FF87-483C-460B-B059-5944B932AAF5}" srcOrd="2" destOrd="0" parTransId="{27655100-9AF9-40ED-95A1-8DEEA190E0BB}" sibTransId="{3A8E7F11-7865-4FA1-9E8D-A2846A530397}"/>
+    <dgm:cxn modelId="{D174DE58-18A6-4F68-BDF4-52641B848A75}" type="presOf" srcId="{3A8E7F11-7865-4FA1-9E8D-A2846A530397}" destId="{A22C3B70-622C-4056-8128-97C5098A1340}" srcOrd="0" destOrd="0" presId="urn:microsoft.com/office/officeart/2005/8/layout/cycle2"/>
     <dgm:cxn modelId="{B0DD9572-9E8F-46EA-807F-1305BC79E94F}" type="presOf" srcId="{AAFF2AC0-A20D-4674-8CF1-6922B0AF3A42}" destId="{39E130A9-5542-4250-97DF-C6ABC3002A28}" srcOrd="0" destOrd="0" presId="urn:microsoft.com/office/officeart/2005/8/layout/cycle2"/>
     <dgm:cxn modelId="{E41EBD75-8CEC-49F6-B113-99E95D90D131}" srcId="{CF7B38A6-BDF5-4ADE-8C80-0AFF2926D96E}" destId="{0B3A1F6D-74AC-4F00-989C-74A65FA6F9A0}" srcOrd="1" destOrd="0" parTransId="{CECBC6AC-3AAA-47A9-B4C9-19E696ADA2C9}" sibTransId="{D62CB151-6B45-4224-8A5C-BB757B17EA00}"/>
-    <dgm:cxn modelId="{78DE9457-F6C0-4D70-998B-9E4219EDB214}" srcId="{CF7B38A6-BDF5-4ADE-8C80-0AFF2926D96E}" destId="{2403FF87-483C-460B-B059-5944B932AAF5}" srcOrd="2" destOrd="0" parTransId="{27655100-9AF9-40ED-95A1-8DEEA190E0BB}" sibTransId="{3A8E7F11-7865-4FA1-9E8D-A2846A530397}"/>
-    <dgm:cxn modelId="{D174DE58-18A6-4F68-BDF4-52641B848A75}" type="presOf" srcId="{3A8E7F11-7865-4FA1-9E8D-A2846A530397}" destId="{A22C3B70-622C-4056-8128-97C5098A1340}" srcOrd="0" destOrd="0" presId="urn:microsoft.com/office/officeart/2005/8/layout/cycle2"/>
     <dgm:cxn modelId="{27659593-C6E4-4912-8097-4094D13B7B5A}" type="presOf" srcId="{D9E4237F-C0EF-4738-B65F-8A6DF5F1296E}" destId="{9268BC45-364B-4E5C-B58D-1B295C77D876}" srcOrd="0" destOrd="0" presId="urn:microsoft.com/office/officeart/2005/8/layout/cycle2"/>
     <dgm:cxn modelId="{C6EBE09F-828F-4573-9A69-515E61E886EC}" type="presOf" srcId="{D62CB151-6B45-4224-8A5C-BB757B17EA00}" destId="{9536DA5D-ED3E-4A9F-8E64-D0881E7DD876}" srcOrd="0" destOrd="0" presId="urn:microsoft.com/office/officeart/2005/8/layout/cycle2"/>
     <dgm:cxn modelId="{5138A4A9-92E2-4688-9BE2-ACC6ACD9774A}" type="presOf" srcId="{2403FF87-483C-460B-B059-5944B932AAF5}" destId="{5BF0DE76-7FFE-4221-B598-8AAC4EF6CA6B}" srcOrd="0" destOrd="0" presId="urn:microsoft.com/office/officeart/2005/8/layout/cycle2"/>
@@ -18243,10 +18263,10 @@
     <dgm:cxn modelId="{1523D512-CBC4-4263-943D-369AE69755B3}" type="presOf" srcId="{0B3A1F6D-74AC-4F00-989C-74A65FA6F9A0}" destId="{C7B82EC5-57FD-4DFB-8692-E1B0E88F2C12}" srcOrd="0" destOrd="0" presId="urn:microsoft.com/office/officeart/2005/8/layout/cycle2"/>
     <dgm:cxn modelId="{B89D4A20-A9A4-4169-896D-DBF22EF14A70}" srcId="{CF7B38A6-BDF5-4ADE-8C80-0AFF2926D96E}" destId="{D9E4237F-C0EF-4738-B65F-8A6DF5F1296E}" srcOrd="0" destOrd="0" parTransId="{7EB06E0D-2728-4216-AE86-683E4C12720E}" sibTransId="{AAFF2AC0-A20D-4674-8CF1-6922B0AF3A42}"/>
     <dgm:cxn modelId="{8047CD2D-1B6D-42F1-961A-2531F4FAABCB}" type="presOf" srcId="{D62CB151-6B45-4224-8A5C-BB757B17EA00}" destId="{628C821E-22AB-433A-841A-B9E0C956E1F4}" srcOrd="1" destOrd="0" presId="urn:microsoft.com/office/officeart/2005/8/layout/cycle2"/>
+    <dgm:cxn modelId="{78DE9457-F6C0-4D70-998B-9E4219EDB214}" srcId="{CF7B38A6-BDF5-4ADE-8C80-0AFF2926D96E}" destId="{2403FF87-483C-460B-B059-5944B932AAF5}" srcOrd="2" destOrd="0" parTransId="{27655100-9AF9-40ED-95A1-8DEEA190E0BB}" sibTransId="{3A8E7F11-7865-4FA1-9E8D-A2846A530397}"/>
+    <dgm:cxn modelId="{D174DE58-18A6-4F68-BDF4-52641B848A75}" type="presOf" srcId="{3A8E7F11-7865-4FA1-9E8D-A2846A530397}" destId="{A22C3B70-622C-4056-8128-97C5098A1340}" srcOrd="0" destOrd="0" presId="urn:microsoft.com/office/officeart/2005/8/layout/cycle2"/>
     <dgm:cxn modelId="{B0DD9572-9E8F-46EA-807F-1305BC79E94F}" type="presOf" srcId="{AAFF2AC0-A20D-4674-8CF1-6922B0AF3A42}" destId="{39E130A9-5542-4250-97DF-C6ABC3002A28}" srcOrd="0" destOrd="0" presId="urn:microsoft.com/office/officeart/2005/8/layout/cycle2"/>
     <dgm:cxn modelId="{E41EBD75-8CEC-49F6-B113-99E95D90D131}" srcId="{CF7B38A6-BDF5-4ADE-8C80-0AFF2926D96E}" destId="{0B3A1F6D-74AC-4F00-989C-74A65FA6F9A0}" srcOrd="1" destOrd="0" parTransId="{CECBC6AC-3AAA-47A9-B4C9-19E696ADA2C9}" sibTransId="{D62CB151-6B45-4224-8A5C-BB757B17EA00}"/>
-    <dgm:cxn modelId="{78DE9457-F6C0-4D70-998B-9E4219EDB214}" srcId="{CF7B38A6-BDF5-4ADE-8C80-0AFF2926D96E}" destId="{2403FF87-483C-460B-B059-5944B932AAF5}" srcOrd="2" destOrd="0" parTransId="{27655100-9AF9-40ED-95A1-8DEEA190E0BB}" sibTransId="{3A8E7F11-7865-4FA1-9E8D-A2846A530397}"/>
-    <dgm:cxn modelId="{D174DE58-18A6-4F68-BDF4-52641B848A75}" type="presOf" srcId="{3A8E7F11-7865-4FA1-9E8D-A2846A530397}" destId="{A22C3B70-622C-4056-8128-97C5098A1340}" srcOrd="0" destOrd="0" presId="urn:microsoft.com/office/officeart/2005/8/layout/cycle2"/>
     <dgm:cxn modelId="{27659593-C6E4-4912-8097-4094D13B7B5A}" type="presOf" srcId="{D9E4237F-C0EF-4738-B65F-8A6DF5F1296E}" destId="{9268BC45-364B-4E5C-B58D-1B295C77D876}" srcOrd="0" destOrd="0" presId="urn:microsoft.com/office/officeart/2005/8/layout/cycle2"/>
     <dgm:cxn modelId="{C6EBE09F-828F-4573-9A69-515E61E886EC}" type="presOf" srcId="{D62CB151-6B45-4224-8A5C-BB757B17EA00}" destId="{9536DA5D-ED3E-4A9F-8E64-D0881E7DD876}" srcOrd="0" destOrd="0" presId="urn:microsoft.com/office/officeart/2005/8/layout/cycle2"/>
     <dgm:cxn modelId="{5138A4A9-92E2-4688-9BE2-ACC6ACD9774A}" type="presOf" srcId="{2403FF87-483C-460B-B059-5944B932AAF5}" destId="{5BF0DE76-7FFE-4221-B598-8AAC4EF6CA6B}" srcOrd="0" destOrd="0" presId="urn:microsoft.com/office/officeart/2005/8/layout/cycle2"/>
@@ -18457,10 +18477,10 @@
     <dgm:cxn modelId="{1523D512-CBC4-4263-943D-369AE69755B3}" type="presOf" srcId="{0B3A1F6D-74AC-4F00-989C-74A65FA6F9A0}" destId="{C7B82EC5-57FD-4DFB-8692-E1B0E88F2C12}" srcOrd="0" destOrd="0" presId="urn:microsoft.com/office/officeart/2005/8/layout/cycle2"/>
     <dgm:cxn modelId="{B89D4A20-A9A4-4169-896D-DBF22EF14A70}" srcId="{CF7B38A6-BDF5-4ADE-8C80-0AFF2926D96E}" destId="{D9E4237F-C0EF-4738-B65F-8A6DF5F1296E}" srcOrd="0" destOrd="0" parTransId="{7EB06E0D-2728-4216-AE86-683E4C12720E}" sibTransId="{AAFF2AC0-A20D-4674-8CF1-6922B0AF3A42}"/>
     <dgm:cxn modelId="{8047CD2D-1B6D-42F1-961A-2531F4FAABCB}" type="presOf" srcId="{D62CB151-6B45-4224-8A5C-BB757B17EA00}" destId="{628C821E-22AB-433A-841A-B9E0C956E1F4}" srcOrd="1" destOrd="0" presId="urn:microsoft.com/office/officeart/2005/8/layout/cycle2"/>
+    <dgm:cxn modelId="{78DE9457-F6C0-4D70-998B-9E4219EDB214}" srcId="{CF7B38A6-BDF5-4ADE-8C80-0AFF2926D96E}" destId="{2403FF87-483C-460B-B059-5944B932AAF5}" srcOrd="2" destOrd="0" parTransId="{27655100-9AF9-40ED-95A1-8DEEA190E0BB}" sibTransId="{3A8E7F11-7865-4FA1-9E8D-A2846A530397}"/>
+    <dgm:cxn modelId="{D174DE58-18A6-4F68-BDF4-52641B848A75}" type="presOf" srcId="{3A8E7F11-7865-4FA1-9E8D-A2846A530397}" destId="{A22C3B70-622C-4056-8128-97C5098A1340}" srcOrd="0" destOrd="0" presId="urn:microsoft.com/office/officeart/2005/8/layout/cycle2"/>
     <dgm:cxn modelId="{B0DD9572-9E8F-46EA-807F-1305BC79E94F}" type="presOf" srcId="{AAFF2AC0-A20D-4674-8CF1-6922B0AF3A42}" destId="{39E130A9-5542-4250-97DF-C6ABC3002A28}" srcOrd="0" destOrd="0" presId="urn:microsoft.com/office/officeart/2005/8/layout/cycle2"/>
     <dgm:cxn modelId="{E41EBD75-8CEC-49F6-B113-99E95D90D131}" srcId="{CF7B38A6-BDF5-4ADE-8C80-0AFF2926D96E}" destId="{0B3A1F6D-74AC-4F00-989C-74A65FA6F9A0}" srcOrd="1" destOrd="0" parTransId="{CECBC6AC-3AAA-47A9-B4C9-19E696ADA2C9}" sibTransId="{D62CB151-6B45-4224-8A5C-BB757B17EA00}"/>
-    <dgm:cxn modelId="{78DE9457-F6C0-4D70-998B-9E4219EDB214}" srcId="{CF7B38A6-BDF5-4ADE-8C80-0AFF2926D96E}" destId="{2403FF87-483C-460B-B059-5944B932AAF5}" srcOrd="2" destOrd="0" parTransId="{27655100-9AF9-40ED-95A1-8DEEA190E0BB}" sibTransId="{3A8E7F11-7865-4FA1-9E8D-A2846A530397}"/>
-    <dgm:cxn modelId="{D174DE58-18A6-4F68-BDF4-52641B848A75}" type="presOf" srcId="{3A8E7F11-7865-4FA1-9E8D-A2846A530397}" destId="{A22C3B70-622C-4056-8128-97C5098A1340}" srcOrd="0" destOrd="0" presId="urn:microsoft.com/office/officeart/2005/8/layout/cycle2"/>
     <dgm:cxn modelId="{27659593-C6E4-4912-8097-4094D13B7B5A}" type="presOf" srcId="{D9E4237F-C0EF-4738-B65F-8A6DF5F1296E}" destId="{9268BC45-364B-4E5C-B58D-1B295C77D876}" srcOrd="0" destOrd="0" presId="urn:microsoft.com/office/officeart/2005/8/layout/cycle2"/>
     <dgm:cxn modelId="{C6EBE09F-828F-4573-9A69-515E61E886EC}" type="presOf" srcId="{D62CB151-6B45-4224-8A5C-BB757B17EA00}" destId="{9536DA5D-ED3E-4A9F-8E64-D0881E7DD876}" srcOrd="0" destOrd="0" presId="urn:microsoft.com/office/officeart/2005/8/layout/cycle2"/>
     <dgm:cxn modelId="{5138A4A9-92E2-4688-9BE2-ACC6ACD9774A}" type="presOf" srcId="{2403FF87-483C-460B-B059-5944B932AAF5}" destId="{5BF0DE76-7FFE-4221-B598-8AAC4EF6CA6B}" srcOrd="0" destOrd="0" presId="urn:microsoft.com/office/officeart/2005/8/layout/cycle2"/>
@@ -18671,10 +18691,10 @@
     <dgm:cxn modelId="{1523D512-CBC4-4263-943D-369AE69755B3}" type="presOf" srcId="{0B3A1F6D-74AC-4F00-989C-74A65FA6F9A0}" destId="{C7B82EC5-57FD-4DFB-8692-E1B0E88F2C12}" srcOrd="0" destOrd="0" presId="urn:microsoft.com/office/officeart/2005/8/layout/cycle2"/>
     <dgm:cxn modelId="{B89D4A20-A9A4-4169-896D-DBF22EF14A70}" srcId="{CF7B38A6-BDF5-4ADE-8C80-0AFF2926D96E}" destId="{D9E4237F-C0EF-4738-B65F-8A6DF5F1296E}" srcOrd="0" destOrd="0" parTransId="{7EB06E0D-2728-4216-AE86-683E4C12720E}" sibTransId="{AAFF2AC0-A20D-4674-8CF1-6922B0AF3A42}"/>
     <dgm:cxn modelId="{8047CD2D-1B6D-42F1-961A-2531F4FAABCB}" type="presOf" srcId="{D62CB151-6B45-4224-8A5C-BB757B17EA00}" destId="{628C821E-22AB-433A-841A-B9E0C956E1F4}" srcOrd="1" destOrd="0" presId="urn:microsoft.com/office/officeart/2005/8/layout/cycle2"/>
+    <dgm:cxn modelId="{78DE9457-F6C0-4D70-998B-9E4219EDB214}" srcId="{CF7B38A6-BDF5-4ADE-8C80-0AFF2926D96E}" destId="{2403FF87-483C-460B-B059-5944B932AAF5}" srcOrd="2" destOrd="0" parTransId="{27655100-9AF9-40ED-95A1-8DEEA190E0BB}" sibTransId="{3A8E7F11-7865-4FA1-9E8D-A2846A530397}"/>
+    <dgm:cxn modelId="{D174DE58-18A6-4F68-BDF4-52641B848A75}" type="presOf" srcId="{3A8E7F11-7865-4FA1-9E8D-A2846A530397}" destId="{A22C3B70-622C-4056-8128-97C5098A1340}" srcOrd="0" destOrd="0" presId="urn:microsoft.com/office/officeart/2005/8/layout/cycle2"/>
     <dgm:cxn modelId="{B0DD9572-9E8F-46EA-807F-1305BC79E94F}" type="presOf" srcId="{AAFF2AC0-A20D-4674-8CF1-6922B0AF3A42}" destId="{39E130A9-5542-4250-97DF-C6ABC3002A28}" srcOrd="0" destOrd="0" presId="urn:microsoft.com/office/officeart/2005/8/layout/cycle2"/>
     <dgm:cxn modelId="{E41EBD75-8CEC-49F6-B113-99E95D90D131}" srcId="{CF7B38A6-BDF5-4ADE-8C80-0AFF2926D96E}" destId="{0B3A1F6D-74AC-4F00-989C-74A65FA6F9A0}" srcOrd="1" destOrd="0" parTransId="{CECBC6AC-3AAA-47A9-B4C9-19E696ADA2C9}" sibTransId="{D62CB151-6B45-4224-8A5C-BB757B17EA00}"/>
-    <dgm:cxn modelId="{78DE9457-F6C0-4D70-998B-9E4219EDB214}" srcId="{CF7B38A6-BDF5-4ADE-8C80-0AFF2926D96E}" destId="{2403FF87-483C-460B-B059-5944B932AAF5}" srcOrd="2" destOrd="0" parTransId="{27655100-9AF9-40ED-95A1-8DEEA190E0BB}" sibTransId="{3A8E7F11-7865-4FA1-9E8D-A2846A530397}"/>
-    <dgm:cxn modelId="{D174DE58-18A6-4F68-BDF4-52641B848A75}" type="presOf" srcId="{3A8E7F11-7865-4FA1-9E8D-A2846A530397}" destId="{A22C3B70-622C-4056-8128-97C5098A1340}" srcOrd="0" destOrd="0" presId="urn:microsoft.com/office/officeart/2005/8/layout/cycle2"/>
     <dgm:cxn modelId="{27659593-C6E4-4912-8097-4094D13B7B5A}" type="presOf" srcId="{D9E4237F-C0EF-4738-B65F-8A6DF5F1296E}" destId="{9268BC45-364B-4E5C-B58D-1B295C77D876}" srcOrd="0" destOrd="0" presId="urn:microsoft.com/office/officeart/2005/8/layout/cycle2"/>
     <dgm:cxn modelId="{C6EBE09F-828F-4573-9A69-515E61E886EC}" type="presOf" srcId="{D62CB151-6B45-4224-8A5C-BB757B17EA00}" destId="{9536DA5D-ED3E-4A9F-8E64-D0881E7DD876}" srcOrd="0" destOrd="0" presId="urn:microsoft.com/office/officeart/2005/8/layout/cycle2"/>
     <dgm:cxn modelId="{5138A4A9-92E2-4688-9BE2-ACC6ACD9774A}" type="presOf" srcId="{2403FF87-483C-460B-B059-5944B932AAF5}" destId="{5BF0DE76-7FFE-4221-B598-8AAC4EF6CA6B}" srcOrd="0" destOrd="0" presId="urn:microsoft.com/office/officeart/2005/8/layout/cycle2"/>
@@ -19031,8 +19051,8 @@
       </dsp:nvSpPr>
       <dsp:spPr>
         <a:xfrm>
-          <a:off x="521875" y="106342"/>
-          <a:ext cx="694136" cy="694136"/>
+          <a:off x="521907" y="106450"/>
+          <a:ext cx="694179" cy="694179"/>
         </a:xfrm>
         <a:prstGeom prst="ellipse">
           <a:avLst/>
@@ -19074,12 +19094,12 @@
         </a:fontRef>
       </dsp:style>
       <dsp:txBody>
-        <a:bodyPr spcFirstLastPara="0" vert="horz" wrap="square" lIns="12700" tIns="12700" rIns="12700" bIns="12700" numCol="1" spcCol="1270" anchor="ctr" anchorCtr="0">
+        <a:bodyPr spcFirstLastPara="0" vert="horz" wrap="square" lIns="11430" tIns="11430" rIns="11430" bIns="11430" numCol="1" spcCol="1270" anchor="ctr" anchorCtr="0">
           <a:noAutofit/>
         </a:bodyPr>
         <a:lstStyle/>
         <a:p>
-          <a:pPr marL="0" lvl="0" indent="0" algn="ctr" defTabSz="444500">
+          <a:pPr marL="0" lvl="0" indent="0" algn="ctr" defTabSz="400050">
             <a:lnSpc>
               <a:spcPct val="90000"/>
             </a:lnSpc>
@@ -19092,14 +19112,14 @@
             <a:buNone/>
           </a:pPr>
           <a:r>
-            <a:rPr lang="en-GB" sz="1000" kern="1200"/>
+            <a:rPr lang="en-GB" sz="900" kern="1200"/>
             <a:t>Discover</a:t>
           </a:r>
         </a:p>
       </dsp:txBody>
       <dsp:txXfrm>
-        <a:off x="623529" y="207996"/>
-        <a:ext cx="490828" cy="490828"/>
+        <a:off x="623567" y="208110"/>
+        <a:ext cx="490859" cy="490859"/>
       </dsp:txXfrm>
     </dsp:sp>
     <dsp:sp modelId="{39E130A9-5542-4250-97DF-C6ABC3002A28}">
@@ -19109,8 +19129,8 @@
       </dsp:nvSpPr>
       <dsp:spPr>
         <a:xfrm rot="3600000">
-          <a:off x="1034629" y="783367"/>
-          <a:ext cx="184887" cy="234271"/>
+          <a:off x="1034692" y="783517"/>
+          <a:ext cx="184899" cy="234285"/>
         </a:xfrm>
         <a:prstGeom prst="rightArrow">
           <a:avLst>
@@ -19152,7 +19172,7 @@
         </a:bodyPr>
         <a:lstStyle/>
         <a:p>
-          <a:pPr marL="0" lvl="0" indent="0" algn="ctr" defTabSz="355600">
+          <a:pPr marL="0" lvl="0" indent="0" algn="ctr" defTabSz="311150">
             <a:lnSpc>
               <a:spcPct val="90000"/>
             </a:lnSpc>
@@ -19164,12 +19184,12 @@
             </a:spcAft>
             <a:buNone/>
           </a:pPr>
-          <a:endParaRPr lang="en-GB" sz="800" kern="1200"/>
+          <a:endParaRPr lang="en-GB" sz="700" kern="1200"/>
         </a:p>
       </dsp:txBody>
       <dsp:txXfrm>
-        <a:off x="1048496" y="806204"/>
-        <a:ext cx="129421" cy="140563"/>
+        <a:off x="1048560" y="806355"/>
+        <a:ext cx="129429" cy="140571"/>
       </dsp:txXfrm>
     </dsp:sp>
     <dsp:sp modelId="{C7B82EC5-57FD-4DFB-8692-E1B0E88F2C12}">
@@ -19179,8 +19199,8 @@
       </dsp:nvSpPr>
       <dsp:spPr>
         <a:xfrm>
-          <a:off x="1043366" y="1009591"/>
-          <a:ext cx="694136" cy="694136"/>
+          <a:off x="1043430" y="1009754"/>
+          <a:ext cx="694179" cy="694179"/>
         </a:xfrm>
         <a:prstGeom prst="ellipse">
           <a:avLst/>
@@ -19222,12 +19242,12 @@
         </a:fontRef>
       </dsp:style>
       <dsp:txBody>
-        <a:bodyPr spcFirstLastPara="0" vert="horz" wrap="square" lIns="12700" tIns="12700" rIns="12700" bIns="12700" numCol="1" spcCol="1270" anchor="ctr" anchorCtr="0">
+        <a:bodyPr spcFirstLastPara="0" vert="horz" wrap="square" lIns="11430" tIns="11430" rIns="11430" bIns="11430" numCol="1" spcCol="1270" anchor="ctr" anchorCtr="0">
           <a:noAutofit/>
         </a:bodyPr>
         <a:lstStyle/>
         <a:p>
-          <a:pPr marL="0" lvl="0" indent="0" algn="ctr" defTabSz="444500">
+          <a:pPr marL="0" lvl="0" indent="0" algn="ctr" defTabSz="400050">
             <a:lnSpc>
               <a:spcPct val="90000"/>
             </a:lnSpc>
@@ -19240,14 +19260,14 @@
             <a:buNone/>
           </a:pPr>
           <a:r>
-            <a:rPr lang="en-GB" sz="1000" kern="1200"/>
+            <a:rPr lang="en-GB" sz="900" kern="1200"/>
             <a:t>Design</a:t>
           </a:r>
         </a:p>
       </dsp:txBody>
       <dsp:txXfrm>
-        <a:off x="1145020" y="1111245"/>
-        <a:ext cx="490828" cy="490828"/>
+        <a:off x="1145090" y="1111414"/>
+        <a:ext cx="490859" cy="490859"/>
       </dsp:txXfrm>
     </dsp:sp>
     <dsp:sp modelId="{9536DA5D-ED3E-4A9F-8E64-D0881E7DD876}">
@@ -19257,8 +19277,8 @@
       </dsp:nvSpPr>
       <dsp:spPr>
         <a:xfrm rot="10800000">
-          <a:off x="781732" y="1239523"/>
-          <a:ext cx="184887" cy="234271"/>
+          <a:off x="781780" y="1239701"/>
+          <a:ext cx="184899" cy="234285"/>
         </a:xfrm>
         <a:prstGeom prst="rightArrow">
           <a:avLst>
@@ -19300,7 +19320,7 @@
         </a:bodyPr>
         <a:lstStyle/>
         <a:p>
-          <a:pPr marL="0" lvl="0" indent="0" algn="ctr" defTabSz="355600">
+          <a:pPr marL="0" lvl="0" indent="0" algn="ctr" defTabSz="311150">
             <a:lnSpc>
               <a:spcPct val="90000"/>
             </a:lnSpc>
@@ -19312,12 +19332,12 @@
             </a:spcAft>
             <a:buNone/>
           </a:pPr>
-          <a:endParaRPr lang="en-GB" sz="800" kern="1200"/>
+          <a:endParaRPr lang="en-GB" sz="700" kern="1200"/>
         </a:p>
       </dsp:txBody>
       <dsp:txXfrm rot="10800000">
-        <a:off x="837198" y="1286377"/>
-        <a:ext cx="129421" cy="140563"/>
+        <a:off x="837250" y="1286558"/>
+        <a:ext cx="129429" cy="140571"/>
       </dsp:txXfrm>
     </dsp:sp>
     <dsp:sp modelId="{5BF0DE76-7FFE-4221-B598-8AAC4EF6CA6B}">
@@ -19327,8 +19347,8 @@
       </dsp:nvSpPr>
       <dsp:spPr>
         <a:xfrm>
-          <a:off x="384" y="1009591"/>
-          <a:ext cx="694136" cy="694136"/>
+          <a:off x="384" y="1009754"/>
+          <a:ext cx="694179" cy="694179"/>
         </a:xfrm>
         <a:prstGeom prst="ellipse">
           <a:avLst/>
@@ -19370,12 +19390,12 @@
         </a:fontRef>
       </dsp:style>
       <dsp:txBody>
-        <a:bodyPr spcFirstLastPara="0" vert="horz" wrap="square" lIns="12700" tIns="12700" rIns="12700" bIns="12700" numCol="1" spcCol="1270" anchor="ctr" anchorCtr="0">
+        <a:bodyPr spcFirstLastPara="0" vert="horz" wrap="square" lIns="11430" tIns="11430" rIns="11430" bIns="11430" numCol="1" spcCol="1270" anchor="ctr" anchorCtr="0">
           <a:noAutofit/>
         </a:bodyPr>
         <a:lstStyle/>
         <a:p>
-          <a:pPr marL="0" lvl="0" indent="0" algn="ctr" defTabSz="444500">
+          <a:pPr marL="0" lvl="0" indent="0" algn="ctr" defTabSz="400050">
             <a:lnSpc>
               <a:spcPct val="90000"/>
             </a:lnSpc>
@@ -19388,14 +19408,14 @@
             <a:buNone/>
           </a:pPr>
           <a:r>
-            <a:rPr lang="en-GB" sz="1000" kern="1200"/>
+            <a:rPr lang="en-GB" sz="900" kern="1200"/>
             <a:t>Deploy</a:t>
           </a:r>
         </a:p>
       </dsp:txBody>
       <dsp:txXfrm>
-        <a:off x="102038" y="1111245"/>
-        <a:ext cx="490828" cy="490828"/>
+        <a:off x="102044" y="1111414"/>
+        <a:ext cx="490859" cy="490859"/>
       </dsp:txXfrm>
     </dsp:sp>
     <dsp:sp modelId="{A22C3B70-622C-4056-8128-97C5098A1340}">
@@ -19405,8 +19425,8 @@
       </dsp:nvSpPr>
       <dsp:spPr>
         <a:xfrm rot="18000000">
-          <a:off x="513138" y="792431"/>
-          <a:ext cx="184887" cy="234271"/>
+          <a:off x="513169" y="792581"/>
+          <a:ext cx="184899" cy="234285"/>
         </a:xfrm>
         <a:prstGeom prst="rightArrow">
           <a:avLst>
@@ -19448,7 +19468,7 @@
         </a:bodyPr>
         <a:lstStyle/>
         <a:p>
-          <a:pPr marL="0" lvl="0" indent="0" algn="ctr" defTabSz="355600">
+          <a:pPr marL="0" lvl="0" indent="0" algn="ctr" defTabSz="311150">
             <a:lnSpc>
               <a:spcPct val="90000"/>
             </a:lnSpc>
@@ -19460,12 +19480,12 @@
             </a:spcAft>
             <a:buNone/>
           </a:pPr>
-          <a:endParaRPr lang="en-GB" sz="800" kern="1200"/>
+          <a:endParaRPr lang="en-GB" sz="700" kern="1200"/>
         </a:p>
       </dsp:txBody>
       <dsp:txXfrm>
-        <a:off x="527005" y="863302"/>
-        <a:ext cx="129421" cy="140563"/>
+        <a:off x="527037" y="863457"/>
+        <a:ext cx="129429" cy="140571"/>
       </dsp:txXfrm>
     </dsp:sp>
   </dsp:spTree>
@@ -19487,8 +19507,8 @@
       </dsp:nvSpPr>
       <dsp:spPr>
         <a:xfrm>
-          <a:off x="521875" y="106342"/>
-          <a:ext cx="694136" cy="694136"/>
+          <a:off x="521907" y="106450"/>
+          <a:ext cx="694179" cy="694179"/>
         </a:xfrm>
         <a:prstGeom prst="ellipse">
           <a:avLst/>
@@ -19530,12 +19550,12 @@
         </a:fontRef>
       </dsp:style>
       <dsp:txBody>
-        <a:bodyPr spcFirstLastPara="0" vert="horz" wrap="square" lIns="12700" tIns="12700" rIns="12700" bIns="12700" numCol="1" spcCol="1270" anchor="ctr" anchorCtr="0">
+        <a:bodyPr spcFirstLastPara="0" vert="horz" wrap="square" lIns="11430" tIns="11430" rIns="11430" bIns="11430" numCol="1" spcCol="1270" anchor="ctr" anchorCtr="0">
           <a:noAutofit/>
         </a:bodyPr>
         <a:lstStyle/>
         <a:p>
-          <a:pPr marL="0" lvl="0" indent="0" algn="ctr" defTabSz="444500">
+          <a:pPr marL="0" lvl="0" indent="0" algn="ctr" defTabSz="400050">
             <a:lnSpc>
               <a:spcPct val="90000"/>
             </a:lnSpc>
@@ -19548,14 +19568,14 @@
             <a:buNone/>
           </a:pPr>
           <a:r>
-            <a:rPr lang="en-GB" sz="1000" kern="1200"/>
+            <a:rPr lang="en-GB" sz="900" kern="1200"/>
             <a:t>Discover</a:t>
           </a:r>
         </a:p>
       </dsp:txBody>
       <dsp:txXfrm>
-        <a:off x="623529" y="207996"/>
-        <a:ext cx="490828" cy="490828"/>
+        <a:off x="623567" y="208110"/>
+        <a:ext cx="490859" cy="490859"/>
       </dsp:txXfrm>
     </dsp:sp>
     <dsp:sp modelId="{39E130A9-5542-4250-97DF-C6ABC3002A28}">
@@ -19565,8 +19585,8 @@
       </dsp:nvSpPr>
       <dsp:spPr>
         <a:xfrm rot="3600000">
-          <a:off x="1034629" y="783367"/>
-          <a:ext cx="184887" cy="234271"/>
+          <a:off x="1034692" y="783517"/>
+          <a:ext cx="184899" cy="234285"/>
         </a:xfrm>
         <a:prstGeom prst="rightArrow">
           <a:avLst>
@@ -19608,7 +19628,7 @@
         </a:bodyPr>
         <a:lstStyle/>
         <a:p>
-          <a:pPr marL="0" lvl="0" indent="0" algn="ctr" defTabSz="355600">
+          <a:pPr marL="0" lvl="0" indent="0" algn="ctr" defTabSz="311150">
             <a:lnSpc>
               <a:spcPct val="90000"/>
             </a:lnSpc>
@@ -19620,12 +19640,12 @@
             </a:spcAft>
             <a:buNone/>
           </a:pPr>
-          <a:endParaRPr lang="en-GB" sz="800" kern="1200"/>
+          <a:endParaRPr lang="en-GB" sz="700" kern="1200"/>
         </a:p>
       </dsp:txBody>
       <dsp:txXfrm>
-        <a:off x="1048496" y="806204"/>
-        <a:ext cx="129421" cy="140563"/>
+        <a:off x="1048560" y="806355"/>
+        <a:ext cx="129429" cy="140571"/>
       </dsp:txXfrm>
     </dsp:sp>
     <dsp:sp modelId="{C7B82EC5-57FD-4DFB-8692-E1B0E88F2C12}">
@@ -19635,8 +19655,8 @@
       </dsp:nvSpPr>
       <dsp:spPr>
         <a:xfrm>
-          <a:off x="1043366" y="1009591"/>
-          <a:ext cx="694136" cy="694136"/>
+          <a:off x="1043430" y="1009754"/>
+          <a:ext cx="694179" cy="694179"/>
         </a:xfrm>
         <a:prstGeom prst="ellipse">
           <a:avLst/>
@@ -19678,12 +19698,12 @@
         </a:fontRef>
       </dsp:style>
       <dsp:txBody>
-        <a:bodyPr spcFirstLastPara="0" vert="horz" wrap="square" lIns="12700" tIns="12700" rIns="12700" bIns="12700" numCol="1" spcCol="1270" anchor="ctr" anchorCtr="0">
+        <a:bodyPr spcFirstLastPara="0" vert="horz" wrap="square" lIns="11430" tIns="11430" rIns="11430" bIns="11430" numCol="1" spcCol="1270" anchor="ctr" anchorCtr="0">
           <a:noAutofit/>
         </a:bodyPr>
         <a:lstStyle/>
         <a:p>
-          <a:pPr marL="0" lvl="0" indent="0" algn="ctr" defTabSz="444500">
+          <a:pPr marL="0" lvl="0" indent="0" algn="ctr" defTabSz="400050">
             <a:lnSpc>
               <a:spcPct val="90000"/>
             </a:lnSpc>
@@ -19696,14 +19716,14 @@
             <a:buNone/>
           </a:pPr>
           <a:r>
-            <a:rPr lang="en-GB" sz="1000" kern="1200"/>
+            <a:rPr lang="en-GB" sz="900" kern="1200"/>
             <a:t>Design</a:t>
           </a:r>
         </a:p>
       </dsp:txBody>
       <dsp:txXfrm>
-        <a:off x="1145020" y="1111245"/>
-        <a:ext cx="490828" cy="490828"/>
+        <a:off x="1145090" y="1111414"/>
+        <a:ext cx="490859" cy="490859"/>
       </dsp:txXfrm>
     </dsp:sp>
     <dsp:sp modelId="{9536DA5D-ED3E-4A9F-8E64-D0881E7DD876}">
@@ -19713,8 +19733,8 @@
       </dsp:nvSpPr>
       <dsp:spPr>
         <a:xfrm rot="10800000">
-          <a:off x="781732" y="1239523"/>
-          <a:ext cx="184887" cy="234271"/>
+          <a:off x="781780" y="1239701"/>
+          <a:ext cx="184899" cy="234285"/>
         </a:xfrm>
         <a:prstGeom prst="rightArrow">
           <a:avLst>
@@ -19756,7 +19776,7 @@
         </a:bodyPr>
         <a:lstStyle/>
         <a:p>
-          <a:pPr marL="0" lvl="0" indent="0" algn="ctr" defTabSz="355600">
+          <a:pPr marL="0" lvl="0" indent="0" algn="ctr" defTabSz="311150">
             <a:lnSpc>
               <a:spcPct val="90000"/>
             </a:lnSpc>
@@ -19768,12 +19788,12 @@
             </a:spcAft>
             <a:buNone/>
           </a:pPr>
-          <a:endParaRPr lang="en-GB" sz="800" kern="1200"/>
+          <a:endParaRPr lang="en-GB" sz="700" kern="1200"/>
         </a:p>
       </dsp:txBody>
       <dsp:txXfrm rot="10800000">
-        <a:off x="837198" y="1286377"/>
-        <a:ext cx="129421" cy="140563"/>
+        <a:off x="837250" y="1286558"/>
+        <a:ext cx="129429" cy="140571"/>
       </dsp:txXfrm>
     </dsp:sp>
     <dsp:sp modelId="{5BF0DE76-7FFE-4221-B598-8AAC4EF6CA6B}">
@@ -19783,8 +19803,8 @@
       </dsp:nvSpPr>
       <dsp:spPr>
         <a:xfrm>
-          <a:off x="384" y="1009591"/>
-          <a:ext cx="694136" cy="694136"/>
+          <a:off x="384" y="1009754"/>
+          <a:ext cx="694179" cy="694179"/>
         </a:xfrm>
         <a:prstGeom prst="ellipse">
           <a:avLst/>
@@ -19826,12 +19846,12 @@
         </a:fontRef>
       </dsp:style>
       <dsp:txBody>
-        <a:bodyPr spcFirstLastPara="0" vert="horz" wrap="square" lIns="12700" tIns="12700" rIns="12700" bIns="12700" numCol="1" spcCol="1270" anchor="ctr" anchorCtr="0">
+        <a:bodyPr spcFirstLastPara="0" vert="horz" wrap="square" lIns="11430" tIns="11430" rIns="11430" bIns="11430" numCol="1" spcCol="1270" anchor="ctr" anchorCtr="0">
           <a:noAutofit/>
         </a:bodyPr>
         <a:lstStyle/>
         <a:p>
-          <a:pPr marL="0" lvl="0" indent="0" algn="ctr" defTabSz="444500">
+          <a:pPr marL="0" lvl="0" indent="0" algn="ctr" defTabSz="400050">
             <a:lnSpc>
               <a:spcPct val="90000"/>
             </a:lnSpc>
@@ -19844,14 +19864,14 @@
             <a:buNone/>
           </a:pPr>
           <a:r>
-            <a:rPr lang="en-GB" sz="1000" kern="1200"/>
+            <a:rPr lang="en-GB" sz="900" kern="1200"/>
             <a:t>Deploy</a:t>
           </a:r>
         </a:p>
       </dsp:txBody>
       <dsp:txXfrm>
-        <a:off x="102038" y="1111245"/>
-        <a:ext cx="490828" cy="490828"/>
+        <a:off x="102044" y="1111414"/>
+        <a:ext cx="490859" cy="490859"/>
       </dsp:txXfrm>
     </dsp:sp>
     <dsp:sp modelId="{A22C3B70-622C-4056-8128-97C5098A1340}">
@@ -19861,8 +19881,8 @@
       </dsp:nvSpPr>
       <dsp:spPr>
         <a:xfrm rot="18000000">
-          <a:off x="513138" y="792431"/>
-          <a:ext cx="184887" cy="234271"/>
+          <a:off x="513169" y="792581"/>
+          <a:ext cx="184899" cy="234285"/>
         </a:xfrm>
         <a:prstGeom prst="rightArrow">
           <a:avLst>
@@ -19904,7 +19924,7 @@
         </a:bodyPr>
         <a:lstStyle/>
         <a:p>
-          <a:pPr marL="0" lvl="0" indent="0" algn="ctr" defTabSz="355600">
+          <a:pPr marL="0" lvl="0" indent="0" algn="ctr" defTabSz="311150">
             <a:lnSpc>
               <a:spcPct val="90000"/>
             </a:lnSpc>
@@ -19916,12 +19936,12 @@
             </a:spcAft>
             <a:buNone/>
           </a:pPr>
-          <a:endParaRPr lang="en-GB" sz="800" kern="1200"/>
+          <a:endParaRPr lang="en-GB" sz="700" kern="1200"/>
         </a:p>
       </dsp:txBody>
       <dsp:txXfrm>
-        <a:off x="527005" y="863302"/>
-        <a:ext cx="129421" cy="140563"/>
+        <a:off x="527037" y="863457"/>
+        <a:ext cx="129429" cy="140571"/>
       </dsp:txXfrm>
     </dsp:sp>
   </dsp:spTree>
@@ -19943,8 +19963,8 @@
       </dsp:nvSpPr>
       <dsp:spPr>
         <a:xfrm>
-          <a:off x="521875" y="106342"/>
-          <a:ext cx="694136" cy="694136"/>
+          <a:off x="521907" y="106450"/>
+          <a:ext cx="694179" cy="694179"/>
         </a:xfrm>
         <a:prstGeom prst="ellipse">
           <a:avLst/>
@@ -19986,12 +20006,12 @@
         </a:fontRef>
       </dsp:style>
       <dsp:txBody>
-        <a:bodyPr spcFirstLastPara="0" vert="horz" wrap="square" lIns="12700" tIns="12700" rIns="12700" bIns="12700" numCol="1" spcCol="1270" anchor="ctr" anchorCtr="0">
+        <a:bodyPr spcFirstLastPara="0" vert="horz" wrap="square" lIns="11430" tIns="11430" rIns="11430" bIns="11430" numCol="1" spcCol="1270" anchor="ctr" anchorCtr="0">
           <a:noAutofit/>
         </a:bodyPr>
         <a:lstStyle/>
         <a:p>
-          <a:pPr marL="0" lvl="0" indent="0" algn="ctr" defTabSz="444500">
+          <a:pPr marL="0" lvl="0" indent="0" algn="ctr" defTabSz="400050">
             <a:lnSpc>
               <a:spcPct val="90000"/>
             </a:lnSpc>
@@ -20004,14 +20024,14 @@
             <a:buNone/>
           </a:pPr>
           <a:r>
-            <a:rPr lang="en-GB" sz="1000" kern="1200"/>
+            <a:rPr lang="en-GB" sz="900" kern="1200"/>
             <a:t>Discover</a:t>
           </a:r>
         </a:p>
       </dsp:txBody>
       <dsp:txXfrm>
-        <a:off x="623529" y="207996"/>
-        <a:ext cx="490828" cy="490828"/>
+        <a:off x="623567" y="208110"/>
+        <a:ext cx="490859" cy="490859"/>
       </dsp:txXfrm>
     </dsp:sp>
     <dsp:sp modelId="{39E130A9-5542-4250-97DF-C6ABC3002A28}">
@@ -20021,8 +20041,8 @@
       </dsp:nvSpPr>
       <dsp:spPr>
         <a:xfrm rot="3600000">
-          <a:off x="1034629" y="783367"/>
-          <a:ext cx="184887" cy="234271"/>
+          <a:off x="1034692" y="783517"/>
+          <a:ext cx="184899" cy="234285"/>
         </a:xfrm>
         <a:prstGeom prst="rightArrow">
           <a:avLst>
@@ -20064,7 +20084,7 @@
         </a:bodyPr>
         <a:lstStyle/>
         <a:p>
-          <a:pPr marL="0" lvl="0" indent="0" algn="ctr" defTabSz="355600">
+          <a:pPr marL="0" lvl="0" indent="0" algn="ctr" defTabSz="311150">
             <a:lnSpc>
               <a:spcPct val="90000"/>
             </a:lnSpc>
@@ -20076,12 +20096,12 @@
             </a:spcAft>
             <a:buNone/>
           </a:pPr>
-          <a:endParaRPr lang="en-GB" sz="800" kern="1200"/>
+          <a:endParaRPr lang="en-GB" sz="700" kern="1200"/>
         </a:p>
       </dsp:txBody>
       <dsp:txXfrm>
-        <a:off x="1048496" y="806204"/>
-        <a:ext cx="129421" cy="140563"/>
+        <a:off x="1048560" y="806355"/>
+        <a:ext cx="129429" cy="140571"/>
       </dsp:txXfrm>
     </dsp:sp>
     <dsp:sp modelId="{C7B82EC5-57FD-4DFB-8692-E1B0E88F2C12}">
@@ -20091,8 +20111,8 @@
       </dsp:nvSpPr>
       <dsp:spPr>
         <a:xfrm>
-          <a:off x="1043366" y="1009591"/>
-          <a:ext cx="694136" cy="694136"/>
+          <a:off x="1043430" y="1009754"/>
+          <a:ext cx="694179" cy="694179"/>
         </a:xfrm>
         <a:prstGeom prst="ellipse">
           <a:avLst/>
@@ -20134,12 +20154,12 @@
         </a:fontRef>
       </dsp:style>
       <dsp:txBody>
-        <a:bodyPr spcFirstLastPara="0" vert="horz" wrap="square" lIns="12700" tIns="12700" rIns="12700" bIns="12700" numCol="1" spcCol="1270" anchor="ctr" anchorCtr="0">
+        <a:bodyPr spcFirstLastPara="0" vert="horz" wrap="square" lIns="11430" tIns="11430" rIns="11430" bIns="11430" numCol="1" spcCol="1270" anchor="ctr" anchorCtr="0">
           <a:noAutofit/>
         </a:bodyPr>
         <a:lstStyle/>
         <a:p>
-          <a:pPr marL="0" lvl="0" indent="0" algn="ctr" defTabSz="444500">
+          <a:pPr marL="0" lvl="0" indent="0" algn="ctr" defTabSz="400050">
             <a:lnSpc>
               <a:spcPct val="90000"/>
             </a:lnSpc>
@@ -20152,14 +20172,14 @@
             <a:buNone/>
           </a:pPr>
           <a:r>
-            <a:rPr lang="en-GB" sz="1000" kern="1200"/>
+            <a:rPr lang="en-GB" sz="900" kern="1200"/>
             <a:t>Design</a:t>
           </a:r>
         </a:p>
       </dsp:txBody>
       <dsp:txXfrm>
-        <a:off x="1145020" y="1111245"/>
-        <a:ext cx="490828" cy="490828"/>
+        <a:off x="1145090" y="1111414"/>
+        <a:ext cx="490859" cy="490859"/>
       </dsp:txXfrm>
     </dsp:sp>
     <dsp:sp modelId="{9536DA5D-ED3E-4A9F-8E64-D0881E7DD876}">
@@ -20169,8 +20189,8 @@
       </dsp:nvSpPr>
       <dsp:spPr>
         <a:xfrm rot="10800000">
-          <a:off x="781732" y="1239523"/>
-          <a:ext cx="184887" cy="234271"/>
+          <a:off x="781780" y="1239701"/>
+          <a:ext cx="184899" cy="234285"/>
         </a:xfrm>
         <a:prstGeom prst="rightArrow">
           <a:avLst>
@@ -20212,7 +20232,7 @@
         </a:bodyPr>
         <a:lstStyle/>
         <a:p>
-          <a:pPr marL="0" lvl="0" indent="0" algn="ctr" defTabSz="355600">
+          <a:pPr marL="0" lvl="0" indent="0" algn="ctr" defTabSz="311150">
             <a:lnSpc>
               <a:spcPct val="90000"/>
             </a:lnSpc>
@@ -20224,12 +20244,12 @@
             </a:spcAft>
             <a:buNone/>
           </a:pPr>
-          <a:endParaRPr lang="en-GB" sz="800" kern="1200"/>
+          <a:endParaRPr lang="en-GB" sz="700" kern="1200"/>
         </a:p>
       </dsp:txBody>
       <dsp:txXfrm rot="10800000">
-        <a:off x="837198" y="1286377"/>
-        <a:ext cx="129421" cy="140563"/>
+        <a:off x="837250" y="1286558"/>
+        <a:ext cx="129429" cy="140571"/>
       </dsp:txXfrm>
     </dsp:sp>
     <dsp:sp modelId="{5BF0DE76-7FFE-4221-B598-8AAC4EF6CA6B}">
@@ -20239,8 +20259,8 @@
       </dsp:nvSpPr>
       <dsp:spPr>
         <a:xfrm>
-          <a:off x="384" y="1009591"/>
-          <a:ext cx="694136" cy="694136"/>
+          <a:off x="384" y="1009754"/>
+          <a:ext cx="694179" cy="694179"/>
         </a:xfrm>
         <a:prstGeom prst="ellipse">
           <a:avLst/>
@@ -20282,12 +20302,12 @@
         </a:fontRef>
       </dsp:style>
       <dsp:txBody>
-        <a:bodyPr spcFirstLastPara="0" vert="horz" wrap="square" lIns="12700" tIns="12700" rIns="12700" bIns="12700" numCol="1" spcCol="1270" anchor="ctr" anchorCtr="0">
+        <a:bodyPr spcFirstLastPara="0" vert="horz" wrap="square" lIns="11430" tIns="11430" rIns="11430" bIns="11430" numCol="1" spcCol="1270" anchor="ctr" anchorCtr="0">
           <a:noAutofit/>
         </a:bodyPr>
         <a:lstStyle/>
         <a:p>
-          <a:pPr marL="0" lvl="0" indent="0" algn="ctr" defTabSz="444500">
+          <a:pPr marL="0" lvl="0" indent="0" algn="ctr" defTabSz="400050">
             <a:lnSpc>
               <a:spcPct val="90000"/>
             </a:lnSpc>
@@ -20300,14 +20320,14 @@
             <a:buNone/>
           </a:pPr>
           <a:r>
-            <a:rPr lang="en-GB" sz="1000" kern="1200"/>
+            <a:rPr lang="en-GB" sz="900" kern="1200"/>
             <a:t>Deploy</a:t>
           </a:r>
         </a:p>
       </dsp:txBody>
       <dsp:txXfrm>
-        <a:off x="102038" y="1111245"/>
-        <a:ext cx="490828" cy="490828"/>
+        <a:off x="102044" y="1111414"/>
+        <a:ext cx="490859" cy="490859"/>
       </dsp:txXfrm>
     </dsp:sp>
     <dsp:sp modelId="{A22C3B70-622C-4056-8128-97C5098A1340}">
@@ -20317,8 +20337,8 @@
       </dsp:nvSpPr>
       <dsp:spPr>
         <a:xfrm rot="18000000">
-          <a:off x="513138" y="792431"/>
-          <a:ext cx="184887" cy="234271"/>
+          <a:off x="513169" y="792581"/>
+          <a:ext cx="184899" cy="234285"/>
         </a:xfrm>
         <a:prstGeom prst="rightArrow">
           <a:avLst>
@@ -20360,7 +20380,7 @@
         </a:bodyPr>
         <a:lstStyle/>
         <a:p>
-          <a:pPr marL="0" lvl="0" indent="0" algn="ctr" defTabSz="355600">
+          <a:pPr marL="0" lvl="0" indent="0" algn="ctr" defTabSz="311150">
             <a:lnSpc>
               <a:spcPct val="90000"/>
             </a:lnSpc>
@@ -20372,12 +20392,12 @@
             </a:spcAft>
             <a:buNone/>
           </a:pPr>
-          <a:endParaRPr lang="en-GB" sz="800" kern="1200"/>
+          <a:endParaRPr lang="en-GB" sz="700" kern="1200"/>
         </a:p>
       </dsp:txBody>
       <dsp:txXfrm>
-        <a:off x="527005" y="863302"/>
-        <a:ext cx="129421" cy="140563"/>
+        <a:off x="527037" y="863457"/>
+        <a:ext cx="129429" cy="140571"/>
       </dsp:txXfrm>
     </dsp:sp>
   </dsp:spTree>
@@ -20399,8 +20419,8 @@
       </dsp:nvSpPr>
       <dsp:spPr>
         <a:xfrm>
-          <a:off x="521875" y="106342"/>
-          <a:ext cx="694136" cy="694136"/>
+          <a:off x="521907" y="106450"/>
+          <a:ext cx="694179" cy="694179"/>
         </a:xfrm>
         <a:prstGeom prst="ellipse">
           <a:avLst/>
@@ -20442,12 +20462,12 @@
         </a:fontRef>
       </dsp:style>
       <dsp:txBody>
-        <a:bodyPr spcFirstLastPara="0" vert="horz" wrap="square" lIns="12700" tIns="12700" rIns="12700" bIns="12700" numCol="1" spcCol="1270" anchor="ctr" anchorCtr="0">
+        <a:bodyPr spcFirstLastPara="0" vert="horz" wrap="square" lIns="11430" tIns="11430" rIns="11430" bIns="11430" numCol="1" spcCol="1270" anchor="ctr" anchorCtr="0">
           <a:noAutofit/>
         </a:bodyPr>
         <a:lstStyle/>
         <a:p>
-          <a:pPr marL="0" lvl="0" indent="0" algn="ctr" defTabSz="444500">
+          <a:pPr marL="0" lvl="0" indent="0" algn="ctr" defTabSz="400050">
             <a:lnSpc>
               <a:spcPct val="90000"/>
             </a:lnSpc>
@@ -20460,14 +20480,14 @@
             <a:buNone/>
           </a:pPr>
           <a:r>
-            <a:rPr lang="en-GB" sz="1000" kern="1200"/>
+            <a:rPr lang="en-GB" sz="900" kern="1200"/>
             <a:t>Discover</a:t>
           </a:r>
         </a:p>
       </dsp:txBody>
       <dsp:txXfrm>
-        <a:off x="623529" y="207996"/>
-        <a:ext cx="490828" cy="490828"/>
+        <a:off x="623567" y="208110"/>
+        <a:ext cx="490859" cy="490859"/>
       </dsp:txXfrm>
     </dsp:sp>
     <dsp:sp modelId="{39E130A9-5542-4250-97DF-C6ABC3002A28}">
@@ -20477,8 +20497,8 @@
       </dsp:nvSpPr>
       <dsp:spPr>
         <a:xfrm rot="3600000">
-          <a:off x="1034629" y="783367"/>
-          <a:ext cx="184887" cy="234271"/>
+          <a:off x="1034692" y="783517"/>
+          <a:ext cx="184899" cy="234285"/>
         </a:xfrm>
         <a:prstGeom prst="rightArrow">
           <a:avLst>
@@ -20520,7 +20540,7 @@
         </a:bodyPr>
         <a:lstStyle/>
         <a:p>
-          <a:pPr marL="0" lvl="0" indent="0" algn="ctr" defTabSz="355600">
+          <a:pPr marL="0" lvl="0" indent="0" algn="ctr" defTabSz="311150">
             <a:lnSpc>
               <a:spcPct val="90000"/>
             </a:lnSpc>
@@ -20532,12 +20552,12 @@
             </a:spcAft>
             <a:buNone/>
           </a:pPr>
-          <a:endParaRPr lang="en-GB" sz="800" kern="1200"/>
+          <a:endParaRPr lang="en-GB" sz="700" kern="1200"/>
         </a:p>
       </dsp:txBody>
       <dsp:txXfrm>
-        <a:off x="1048496" y="806204"/>
-        <a:ext cx="129421" cy="140563"/>
+        <a:off x="1048560" y="806355"/>
+        <a:ext cx="129429" cy="140571"/>
       </dsp:txXfrm>
     </dsp:sp>
     <dsp:sp modelId="{C7B82EC5-57FD-4DFB-8692-E1B0E88F2C12}">
@@ -20547,8 +20567,8 @@
       </dsp:nvSpPr>
       <dsp:spPr>
         <a:xfrm>
-          <a:off x="1043366" y="1009591"/>
-          <a:ext cx="694136" cy="694136"/>
+          <a:off x="1043430" y="1009754"/>
+          <a:ext cx="694179" cy="694179"/>
         </a:xfrm>
         <a:prstGeom prst="ellipse">
           <a:avLst/>
@@ -20590,12 +20610,12 @@
         </a:fontRef>
       </dsp:style>
       <dsp:txBody>
-        <a:bodyPr spcFirstLastPara="0" vert="horz" wrap="square" lIns="12700" tIns="12700" rIns="12700" bIns="12700" numCol="1" spcCol="1270" anchor="ctr" anchorCtr="0">
+        <a:bodyPr spcFirstLastPara="0" vert="horz" wrap="square" lIns="11430" tIns="11430" rIns="11430" bIns="11430" numCol="1" spcCol="1270" anchor="ctr" anchorCtr="0">
           <a:noAutofit/>
         </a:bodyPr>
         <a:lstStyle/>
         <a:p>
-          <a:pPr marL="0" lvl="0" indent="0" algn="ctr" defTabSz="444500">
+          <a:pPr marL="0" lvl="0" indent="0" algn="ctr" defTabSz="400050">
             <a:lnSpc>
               <a:spcPct val="90000"/>
             </a:lnSpc>
@@ -20608,14 +20628,14 @@
             <a:buNone/>
           </a:pPr>
           <a:r>
-            <a:rPr lang="en-GB" sz="1000" kern="1200"/>
+            <a:rPr lang="en-GB" sz="900" kern="1200"/>
             <a:t>Design</a:t>
           </a:r>
         </a:p>
       </dsp:txBody>
       <dsp:txXfrm>
-        <a:off x="1145020" y="1111245"/>
-        <a:ext cx="490828" cy="490828"/>
+        <a:off x="1145090" y="1111414"/>
+        <a:ext cx="490859" cy="490859"/>
       </dsp:txXfrm>
     </dsp:sp>
     <dsp:sp modelId="{9536DA5D-ED3E-4A9F-8E64-D0881E7DD876}">
@@ -20625,8 +20645,8 @@
       </dsp:nvSpPr>
       <dsp:spPr>
         <a:xfrm rot="10800000">
-          <a:off x="781732" y="1239523"/>
-          <a:ext cx="184887" cy="234271"/>
+          <a:off x="781780" y="1239701"/>
+          <a:ext cx="184899" cy="234285"/>
         </a:xfrm>
         <a:prstGeom prst="rightArrow">
           <a:avLst>
@@ -20668,7 +20688,7 @@
         </a:bodyPr>
         <a:lstStyle/>
         <a:p>
-          <a:pPr marL="0" lvl="0" indent="0" algn="ctr" defTabSz="355600">
+          <a:pPr marL="0" lvl="0" indent="0" algn="ctr" defTabSz="311150">
             <a:lnSpc>
               <a:spcPct val="90000"/>
             </a:lnSpc>
@@ -20680,12 +20700,12 @@
             </a:spcAft>
             <a:buNone/>
           </a:pPr>
-          <a:endParaRPr lang="en-GB" sz="800" kern="1200"/>
+          <a:endParaRPr lang="en-GB" sz="700" kern="1200"/>
         </a:p>
       </dsp:txBody>
       <dsp:txXfrm rot="10800000">
-        <a:off x="837198" y="1286377"/>
-        <a:ext cx="129421" cy="140563"/>
+        <a:off x="837250" y="1286558"/>
+        <a:ext cx="129429" cy="140571"/>
       </dsp:txXfrm>
     </dsp:sp>
     <dsp:sp modelId="{5BF0DE76-7FFE-4221-B598-8AAC4EF6CA6B}">
@@ -20695,8 +20715,8 @@
       </dsp:nvSpPr>
       <dsp:spPr>
         <a:xfrm>
-          <a:off x="384" y="1009591"/>
-          <a:ext cx="694136" cy="694136"/>
+          <a:off x="384" y="1009754"/>
+          <a:ext cx="694179" cy="694179"/>
         </a:xfrm>
         <a:prstGeom prst="ellipse">
           <a:avLst/>
@@ -20738,12 +20758,12 @@
         </a:fontRef>
       </dsp:style>
       <dsp:txBody>
-        <a:bodyPr spcFirstLastPara="0" vert="horz" wrap="square" lIns="12700" tIns="12700" rIns="12700" bIns="12700" numCol="1" spcCol="1270" anchor="ctr" anchorCtr="0">
+        <a:bodyPr spcFirstLastPara="0" vert="horz" wrap="square" lIns="11430" tIns="11430" rIns="11430" bIns="11430" numCol="1" spcCol="1270" anchor="ctr" anchorCtr="0">
           <a:noAutofit/>
         </a:bodyPr>
         <a:lstStyle/>
         <a:p>
-          <a:pPr marL="0" lvl="0" indent="0" algn="ctr" defTabSz="444500">
+          <a:pPr marL="0" lvl="0" indent="0" algn="ctr" defTabSz="400050">
             <a:lnSpc>
               <a:spcPct val="90000"/>
             </a:lnSpc>
@@ -20756,14 +20776,14 @@
             <a:buNone/>
           </a:pPr>
           <a:r>
-            <a:rPr lang="en-GB" sz="1000" kern="1200"/>
+            <a:rPr lang="en-GB" sz="900" kern="1200"/>
             <a:t>Deploy</a:t>
           </a:r>
         </a:p>
       </dsp:txBody>
       <dsp:txXfrm>
-        <a:off x="102038" y="1111245"/>
-        <a:ext cx="490828" cy="490828"/>
+        <a:off x="102044" y="1111414"/>
+        <a:ext cx="490859" cy="490859"/>
       </dsp:txXfrm>
     </dsp:sp>
     <dsp:sp modelId="{A22C3B70-622C-4056-8128-97C5098A1340}">
@@ -20773,8 +20793,8 @@
       </dsp:nvSpPr>
       <dsp:spPr>
         <a:xfrm rot="18000000">
-          <a:off x="513138" y="792431"/>
-          <a:ext cx="184887" cy="234271"/>
+          <a:off x="513169" y="792581"/>
+          <a:ext cx="184899" cy="234285"/>
         </a:xfrm>
         <a:prstGeom prst="rightArrow">
           <a:avLst>
@@ -20816,7 +20836,7 @@
         </a:bodyPr>
         <a:lstStyle/>
         <a:p>
-          <a:pPr marL="0" lvl="0" indent="0" algn="ctr" defTabSz="355600">
+          <a:pPr marL="0" lvl="0" indent="0" algn="ctr" defTabSz="311150">
             <a:lnSpc>
               <a:spcPct val="90000"/>
             </a:lnSpc>
@@ -20828,12 +20848,12 @@
             </a:spcAft>
             <a:buNone/>
           </a:pPr>
-          <a:endParaRPr lang="en-GB" sz="800" kern="1200"/>
+          <a:endParaRPr lang="en-GB" sz="700" kern="1200"/>
         </a:p>
       </dsp:txBody>
       <dsp:txXfrm>
-        <a:off x="527005" y="863302"/>
-        <a:ext cx="129421" cy="140563"/>
+        <a:off x="527037" y="863457"/>
+        <a:ext cx="129429" cy="140571"/>
       </dsp:txXfrm>
     </dsp:sp>
   </dsp:spTree>
@@ -27837,21 +27857,15 @@
 </file>
 
 <file path=customXml/item1.xml><?xml version="1.0" encoding="utf-8"?>
-<b:Sources xmlns:b="http://schemas.openxmlformats.org/officeDocument/2006/bibliography" xmlns="http://schemas.openxmlformats.org/officeDocument/2006/bibliography" SelectedStyle="\APASixthEditionOfficeOnline.xsl" StyleName="APA" Version="6"/>
+<?mso-contentType ?>
+<FormTemplates xmlns="http://schemas.microsoft.com/sharepoint/v3/contenttype/forms">
+  <Display>DocumentLibraryForm</Display>
+  <Edit>DocumentLibraryForm</Edit>
+  <New>DocumentLibraryForm</New>
+</FormTemplates>
 </file>
 
 <file path=customXml/item2.xml><?xml version="1.0" encoding="utf-8"?>
-<p:properties xmlns:p="http://schemas.microsoft.com/office/2006/metadata/properties" xmlns:xsi="http://www.w3.org/2001/XMLSchema-instance" xmlns:pc="http://schemas.microsoft.com/office/infopath/2007/PartnerControls">
-  <documentManagement>
-    <TaxCatchAll xmlns="27a1c5e1-2060-4235-b4da-a4ba32adc397" xsi:nil="true"/>
-    <lcf76f155ced4ddcb4097134ff3c332f xmlns="5a18e9fb-fe8a-4794-ab96-bf9465308028">
-      <Terms xmlns="http://schemas.microsoft.com/office/infopath/2007/PartnerControls"/>
-    </lcf76f155ced4ddcb4097134ff3c332f>
-  </documentManagement>
-</p:properties>
-</file>
-
-<file path=customXml/item3.xml><?xml version="1.0" encoding="utf-8"?>
 <ct:contentTypeSchema xmlns:ct="http://schemas.microsoft.com/office/2006/metadata/contentType" xmlns:ma="http://schemas.microsoft.com/office/2006/metadata/properties/metaAttributes" ct:_="" ma:_="" ma:contentTypeName="Document" ma:contentTypeID="0x0101006B3C5AFA9F9D8E4BAC529AF6FBF213B9" ma:contentTypeVersion="14" ma:contentTypeDescription="Create a new document." ma:contentTypeScope="" ma:versionID="b248dd9eef700eb071619c4e74386bac">
   <xsd:schema xmlns:xsd="http://www.w3.org/2001/XMLSchema" xmlns:xs="http://www.w3.org/2001/XMLSchema" xmlns:p="http://schemas.microsoft.com/office/2006/metadata/properties" xmlns:ns2="5a18e9fb-fe8a-4794-ab96-bf9465308028" xmlns:ns3="27a1c5e1-2060-4235-b4da-a4ba32adc397" targetNamespace="http://schemas.microsoft.com/office/2006/metadata/properties" ma:root="true" ma:fieldsID="82db15afd800715abe9ba7c71b9efd42" ns2:_="" ns3:_="">
     <xsd:import namespace="5a18e9fb-fe8a-4794-ab96-bf9465308028"/>
@@ -28064,35 +28078,30 @@
 </ct:contentTypeSchema>
 </file>
 
+<file path=customXml/item3.xml><?xml version="1.0" encoding="utf-8"?>
+<b:Sources xmlns:b="http://schemas.openxmlformats.org/officeDocument/2006/bibliography" xmlns="http://schemas.openxmlformats.org/officeDocument/2006/bibliography" SelectedStyle="\APASixthEditionOfficeOnline.xsl" StyleName="APA" Version="6"/>
+</file>
+
 <file path=customXml/item4.xml><?xml version="1.0" encoding="utf-8"?>
-<?mso-contentType ?>
-<FormTemplates xmlns="http://schemas.microsoft.com/sharepoint/v3/contenttype/forms">
-  <Display>DocumentLibraryForm</Display>
-  <Edit>DocumentLibraryForm</Edit>
-  <New>DocumentLibraryForm</New>
-</FormTemplates>
+<p:properties xmlns:p="http://schemas.microsoft.com/office/2006/metadata/properties" xmlns:xsi="http://www.w3.org/2001/XMLSchema-instance" xmlns:pc="http://schemas.microsoft.com/office/infopath/2007/PartnerControls">
+  <documentManagement>
+    <TaxCatchAll xmlns="27a1c5e1-2060-4235-b4da-a4ba32adc397" xsi:nil="true"/>
+    <lcf76f155ced4ddcb4097134ff3c332f xmlns="5a18e9fb-fe8a-4794-ab96-bf9465308028">
+      <Terms xmlns="http://schemas.microsoft.com/office/infopath/2007/PartnerControls"/>
+    </lcf76f155ced4ddcb4097134ff3c332f>
+  </documentManagement>
+</p:properties>
 </file>
 
 <file path=customXml/itemProps1.xml><?xml version="1.0" encoding="utf-8"?>
-<ds:datastoreItem xmlns:ds="http://schemas.openxmlformats.org/officeDocument/2006/customXml" ds:itemID="{4C68C94E-DADF-4ADF-92F4-839FEAF95404}">
+<ds:datastoreItem xmlns:ds="http://schemas.openxmlformats.org/officeDocument/2006/customXml" ds:itemID="{C64F34FE-AFFA-4396-9F44-EB4FE67BE59B}">
   <ds:schemaRefs>
-    <ds:schemaRef ds:uri="http://schemas.openxmlformats.org/officeDocument/2006/bibliography"/>
+    <ds:schemaRef ds:uri="http://schemas.microsoft.com/sharepoint/v3/contenttype/forms"/>
   </ds:schemaRefs>
 </ds:datastoreItem>
 </file>
 
 <file path=customXml/itemProps2.xml><?xml version="1.0" encoding="utf-8"?>
-<ds:datastoreItem xmlns:ds="http://schemas.openxmlformats.org/officeDocument/2006/customXml" ds:itemID="{A0990AA2-0437-4526-9B9A-BA78197CCF6E}">
-  <ds:schemaRefs>
-    <ds:schemaRef ds:uri="http://schemas.microsoft.com/office/2006/metadata/properties"/>
-    <ds:schemaRef ds:uri="http://schemas.microsoft.com/office/infopath/2007/PartnerControls"/>
-    <ds:schemaRef ds:uri="27a1c5e1-2060-4235-b4da-a4ba32adc397"/>
-    <ds:schemaRef ds:uri="5a18e9fb-fe8a-4794-ab96-bf9465308028"/>
-  </ds:schemaRefs>
-</ds:datastoreItem>
-</file>
-
-<file path=customXml/itemProps3.xml><?xml version="1.0" encoding="utf-8"?>
 <ds:datastoreItem xmlns:ds="http://schemas.openxmlformats.org/officeDocument/2006/customXml" ds:itemID="{113D45D1-7F33-49AC-991F-40FAFC6CCB61}">
   <ds:schemaRefs>
     <ds:schemaRef ds:uri="http://schemas.microsoft.com/office/2006/metadata/contentType"/>
@@ -28111,10 +28120,21 @@
 </ds:datastoreItem>
 </file>
 
+<file path=customXml/itemProps3.xml><?xml version="1.0" encoding="utf-8"?>
+<ds:datastoreItem xmlns:ds="http://schemas.openxmlformats.org/officeDocument/2006/customXml" ds:itemID="{4C68C94E-DADF-4ADF-92F4-839FEAF95404}">
+  <ds:schemaRefs>
+    <ds:schemaRef ds:uri="http://schemas.openxmlformats.org/officeDocument/2006/bibliography"/>
+  </ds:schemaRefs>
+</ds:datastoreItem>
+</file>
+
 <file path=customXml/itemProps4.xml><?xml version="1.0" encoding="utf-8"?>
-<ds:datastoreItem xmlns:ds="http://schemas.openxmlformats.org/officeDocument/2006/customXml" ds:itemID="{C64F34FE-AFFA-4396-9F44-EB4FE67BE59B}">
+<ds:datastoreItem xmlns:ds="http://schemas.openxmlformats.org/officeDocument/2006/customXml" ds:itemID="{A0990AA2-0437-4526-9B9A-BA78197CCF6E}">
   <ds:schemaRefs>
-    <ds:schemaRef ds:uri="http://schemas.microsoft.com/sharepoint/v3/contenttype/forms"/>
+    <ds:schemaRef ds:uri="http://schemas.microsoft.com/office/2006/metadata/properties"/>
+    <ds:schemaRef ds:uri="http://schemas.microsoft.com/office/infopath/2007/PartnerControls"/>
+    <ds:schemaRef ds:uri="27a1c5e1-2060-4235-b4da-a4ba32adc397"/>
+    <ds:schemaRef ds:uri="5a18e9fb-fe8a-4794-ab96-bf9465308028"/>
   </ds:schemaRefs>
 </ds:datastoreItem>
 </file>
</xml_diff>